<commit_message>
updated knowledge base and prompts
</commit_message>
<xml_diff>
--- a/data/knowledge_base/PowerBI_Healthcare_Proposal.docx
+++ b/data/knowledge_base/PowerBI_Healthcare_Proposal.docx
@@ -1090,6 +1090,507 @@
           <w:sz w:val="20"/>
           <w:szCs w:val="20"/>
           <w:shd w:val="clear" w:color="auto" w:fill="FFFFFF"/>
+        </w:rPr>
+      </w:pPr>
+    </w:p>
+    <w:p>
+      <w:pPr>
+        <w:rPr>
+          <w:rFonts w:ascii="Arial" w:hAnsi="Arial" w:cs="Arial"/>
+          <w:color w:val="181818"/>
+          <w:spacing w:val="6"/>
+          <w:sz w:val="20"/>
+          <w:szCs w:val="20"/>
+          <w:shd w:val="clear" w:color="auto" w:fill="FFFFFF"/>
+        </w:rPr>
+      </w:pPr>
+      <w:r>
+        <w:rPr>
+          <w:rFonts w:ascii="Arial" w:hAnsi="Arial" w:cs="Arial"/>
+          <w:color w:val="181818"/>
+          <w:spacing w:val="6"/>
+          <w:sz w:val="20"/>
+          <w:szCs w:val="20"/>
+          <w:shd w:val="clear" w:color="auto" w:fill="FFFFFF"/>
+        </w:rPr>
+        <w:t>Hello, I just went through your post and the video you shared, and the idea of building an interactive map with insights for residential real estate sounds very interesting. I’d be happy to help with this. I have experience working with data visualization tools like Looker Studio and mapping tools to present geographic insights in a clear and user-friendly way. The focus would be on structuring the data properly, adding meaningful annotations, and ensuring the map highlights the insights your team needs. I’ve gone through the video and would be happy to take things forward and discuss the requirements in more detail. Best regards, Sagar</w:t>
+      </w:r>
+    </w:p>
+    <w:p>
+      <w:pPr>
+        <w:rPr>
+          <w:rFonts w:ascii="Arial" w:hAnsi="Arial" w:cs="Arial"/>
+          <w:color w:val="181818"/>
+          <w:spacing w:val="6"/>
+          <w:sz w:val="20"/>
+          <w:szCs w:val="20"/>
+          <w:shd w:val="clear" w:color="auto" w:fill="FFFFFF"/>
+        </w:rPr>
+      </w:pPr>
+    </w:p>
+    <w:p>
+      <w:pPr>
+        <w:rPr>
+          <w:rFonts w:ascii="Arial" w:hAnsi="Arial" w:cs="Arial"/>
+          <w:color w:val="181818"/>
+          <w:spacing w:val="6"/>
+          <w:sz w:val="20"/>
+          <w:szCs w:val="20"/>
+          <w:shd w:val="clear" w:color="auto" w:fill="FFFFFF"/>
+        </w:rPr>
+      </w:pPr>
+      <w:r>
+        <w:rPr>
+          <w:rFonts w:ascii="Arial" w:hAnsi="Arial" w:cs="Arial"/>
+          <w:color w:val="181818"/>
+          <w:spacing w:val="6"/>
+          <w:sz w:val="20"/>
+          <w:szCs w:val="20"/>
+          <w:shd w:val="clear" w:color="auto" w:fill="FFFFFF"/>
+        </w:rPr>
+        <w:t>Hello Abdel, I just went through your post, and I’d be happy to help rebuild a simplified version of your Looker Studio dashboard. I have experience building clean, structured dashboards that focus on clarity, usability, and actionable insights. I’ve worked on several reporting projects where the goal was to simplify complex data into clear visualizations while maintaining a professional layout and performance. I’m comfortable working with different data sources and structuring reports so they remain easy to navigate and interpret. You can find examples of my work in the attachments. Best regards, Sagar</w:t>
+      </w:r>
+    </w:p>
+    <w:p/>
+    <w:p>
+      <w:pPr>
+        <w:rPr>
+          <w:rFonts w:ascii="Arial" w:hAnsi="Arial" w:cs="Arial"/>
+          <w:color w:val="181818"/>
+          <w:spacing w:val="6"/>
+          <w:sz w:val="20"/>
+          <w:szCs w:val="20"/>
+          <w:shd w:val="clear" w:color="auto" w:fill="FFFFFF"/>
+        </w:rPr>
+      </w:pPr>
+      <w:r>
+        <w:rPr>
+          <w:rFonts w:ascii="Arial" w:hAnsi="Arial" w:cs="Arial"/>
+          <w:color w:val="181818"/>
+          <w:spacing w:val="6"/>
+          <w:sz w:val="20"/>
+          <w:szCs w:val="20"/>
+          <w:shd w:val="clear" w:color="auto" w:fill="FFFFFF"/>
+        </w:rPr>
+        <w:t xml:space="preserve">Hello Omid, I just went through your post, and this type of CRM, BigQuery, Looker Studio pipeline is something I’d be happy to help implement. I have experience working with APIs, JSON transformation, and building Looker Studio dashboards using structured BigQuery datasets. A typical approach would involve capturing CRM events via webhooks, processing the JSON through Cloud Functions or Cloud Run, loading it into properly designed BigQuery tables, and then building KPI dashboards for leads, appointments, </w:t>
+      </w:r>
+      <w:r>
+        <w:rPr>
+          <w:rFonts w:ascii="Arial" w:hAnsi="Arial" w:cs="Arial"/>
+          <w:color w:val="181818"/>
+          <w:spacing w:val="6"/>
+          <w:sz w:val="20"/>
+          <w:szCs w:val="20"/>
+          <w:shd w:val="clear" w:color="auto" w:fill="FFFFFF"/>
+        </w:rPr>
+        <w:lastRenderedPageBreak/>
+        <w:t>conversions, and closed deals. I’m available to start immediately and would be happy to discuss the details further if the proposal is taken forward. Best regards, Sagar</w:t>
+      </w:r>
+    </w:p>
+    <w:p>
+      <w:pPr>
+        <w:rPr>
+          <w:rFonts w:ascii="Arial" w:hAnsi="Arial" w:cs="Arial"/>
+          <w:color w:val="181818"/>
+          <w:spacing w:val="6"/>
+          <w:sz w:val="20"/>
+          <w:szCs w:val="20"/>
+          <w:shd w:val="clear" w:color="auto" w:fill="FFFFFF"/>
+        </w:rPr>
+      </w:pPr>
+    </w:p>
+    <w:p>
+      <w:pPr>
+        <w:rPr>
+          <w:rFonts w:ascii="Arial" w:hAnsi="Arial" w:cs="Arial"/>
+          <w:color w:val="181818"/>
+          <w:spacing w:val="6"/>
+          <w:sz w:val="20"/>
+          <w:szCs w:val="20"/>
+          <w:shd w:val="clear" w:color="auto" w:fill="FFFFFF"/>
+        </w:rPr>
+      </w:pPr>
+      <w:r>
+        <w:rPr>
+          <w:rFonts w:ascii="Arial" w:hAnsi="Arial" w:cs="Arial"/>
+          <w:color w:val="181818"/>
+          <w:spacing w:val="6"/>
+          <w:sz w:val="20"/>
+          <w:szCs w:val="20"/>
+          <w:shd w:val="clear" w:color="auto" w:fill="FFFFFF"/>
+        </w:rPr>
+        <w:t>Hello, I just went through your post, and integrating Power BI with Power Automate to trigger backend processes is something I’d be happy to help implement. The workflow can be designed so the button in Power BI triggers a Power Automate flow, which runs the SQL Agent job, waits for completion, and then calls the Power BI REST API to refresh the semantic model. Once the refresh finishes, the initiating user can automatically receive a confirmation notification. I have experience working with Power BI, Power Automate, SQL workflows, and API integrations, and I’d be happy to discuss the implementation further if the proposal is taken forward. Best regards, Sagar</w:t>
+      </w:r>
+    </w:p>
+    <w:p>
+      <w:pPr>
+        <w:rPr>
+          <w:rFonts w:ascii="Arial" w:hAnsi="Arial" w:cs="Arial"/>
+          <w:color w:val="181818"/>
+          <w:spacing w:val="6"/>
+          <w:sz w:val="20"/>
+          <w:szCs w:val="20"/>
+          <w:shd w:val="clear" w:color="auto" w:fill="FFFFFF"/>
+        </w:rPr>
+      </w:pPr>
+    </w:p>
+    <w:p>
+      <w:pPr>
+        <w:rPr>
+          <w:rFonts w:ascii="Arial" w:hAnsi="Arial" w:cs="Arial"/>
+          <w:color w:val="181818"/>
+          <w:spacing w:val="6"/>
+          <w:sz w:val="20"/>
+          <w:szCs w:val="20"/>
+          <w:shd w:val="clear" w:color="auto" w:fill="FFFFFF"/>
+        </w:rPr>
+      </w:pPr>
+      <w:r>
+        <w:rPr>
+          <w:rFonts w:ascii="Arial" w:hAnsi="Arial" w:cs="Arial"/>
+          <w:color w:val="181818"/>
+          <w:spacing w:val="6"/>
+          <w:sz w:val="20"/>
+          <w:szCs w:val="20"/>
+          <w:shd w:val="clear" w:color="auto" w:fill="FFFFFF"/>
+        </w:rPr>
+        <w:t>Hello, I just went through your post, and building automated intake systems using Power Automate is something I have experience with. I also have experience working with AI integrations that help streamline workflows and improve how incoming requests are processed and categorized. I’d be happy to help analyze your current intake process, design the automation, and implement the AI features needed to make the system more efficient. I’ve also shared some examples of my Power Automate work in the attachments. Best regards, Sagar</w:t>
+      </w:r>
+    </w:p>
+    <w:p>
+      <w:pPr>
+        <w:rPr>
+          <w:rFonts w:ascii="Arial" w:hAnsi="Arial" w:cs="Arial"/>
+          <w:color w:val="181818"/>
+          <w:spacing w:val="6"/>
+          <w:sz w:val="20"/>
+          <w:szCs w:val="20"/>
+          <w:shd w:val="clear" w:color="auto" w:fill="FFFFFF"/>
+        </w:rPr>
+      </w:pPr>
+    </w:p>
+    <w:p>
+      <w:pPr>
+        <w:rPr>
+          <w:rFonts w:ascii="Arial" w:hAnsi="Arial" w:cs="Arial"/>
+          <w:color w:val="181818"/>
+          <w:spacing w:val="6"/>
+          <w:sz w:val="20"/>
+          <w:szCs w:val="20"/>
+          <w:shd w:val="clear" w:color="auto" w:fill="FFFFFF"/>
+        </w:rPr>
+      </w:pPr>
+      <w:r>
+        <w:rPr>
+          <w:rFonts w:ascii="Arial" w:hAnsi="Arial" w:cs="Arial"/>
+          <w:color w:val="181818"/>
+          <w:spacing w:val="6"/>
+          <w:sz w:val="20"/>
+          <w:szCs w:val="20"/>
+          <w:shd w:val="clear" w:color="auto" w:fill="FFFFFF"/>
+        </w:rPr>
+        <w:t>Hello, I just went through your post, and building recruitment analytics dashboards in Excel and Power BI is something I’ve worked on frequently. I have experience turning large datasets into clean dashboards with KPIs, funnels, trend analysis, and drill-down views to highlight bottlenecks, ageing roles, and hiring pipeline performance. I’d be happy to help structure your data model and build a clear, professional dashboard that’s easy to refresh and use for strategic decisions. Best regards, Sagar</w:t>
+      </w:r>
+    </w:p>
+    <w:p>
+      <w:pPr>
+        <w:rPr>
+          <w:rFonts w:ascii="Arial" w:hAnsi="Arial" w:cs="Arial"/>
+          <w:color w:val="181818"/>
+          <w:spacing w:val="6"/>
+          <w:sz w:val="20"/>
+          <w:szCs w:val="20"/>
+          <w:shd w:val="clear" w:color="auto" w:fill="FFFFFF"/>
+        </w:rPr>
+      </w:pPr>
+    </w:p>
+    <w:p>
+      <w:pPr>
+        <w:rPr>
+          <w:rFonts w:ascii="Arial" w:hAnsi="Arial" w:cs="Arial"/>
+          <w:color w:val="181818"/>
+          <w:spacing w:val="6"/>
+          <w:sz w:val="20"/>
+          <w:szCs w:val="20"/>
+          <w:shd w:val="clear" w:color="auto" w:fill="FFFFFF"/>
+        </w:rPr>
+      </w:pPr>
+      <w:r>
+        <w:rPr>
+          <w:rFonts w:ascii="Arial" w:hAnsi="Arial" w:cs="Arial"/>
+          <w:color w:val="181818"/>
+          <w:spacing w:val="6"/>
+          <w:sz w:val="20"/>
+          <w:szCs w:val="20"/>
+          <w:shd w:val="clear" w:color="auto" w:fill="FFFFFF"/>
+        </w:rPr>
+        <w:t>Hello AveNew Solutions LLC Team, I just went through your post, and building Power BI dashboards with automated data pipelines using Microsoft Forms and Power Automate is something I have experience with. I can help design the data architecture, automate the flow of Microsoft Forms data into a structured source such as SharePoint or SQL using Power Automate, and then build a clean, professional Power BI dashboard with clear KPIs and visualizations. I’ve shared examples of my Power BI work in the attachments, and I’m available to start immediately. Best regards, Sagar</w:t>
+      </w:r>
+    </w:p>
+    <w:p>
+      <w:pPr>
+        <w:rPr>
+          <w:rFonts w:ascii="Arial" w:hAnsi="Arial" w:cs="Arial"/>
+          <w:color w:val="181818"/>
+          <w:spacing w:val="6"/>
+          <w:sz w:val="20"/>
+          <w:szCs w:val="20"/>
+          <w:shd w:val="clear" w:color="auto" w:fill="FFFFFF"/>
+        </w:rPr>
+      </w:pPr>
+    </w:p>
+    <w:p>
+      <w:pPr>
+        <w:rPr>
+          <w:rFonts w:ascii="Arial" w:hAnsi="Arial" w:cs="Arial"/>
+          <w:color w:val="181818"/>
+          <w:spacing w:val="6"/>
+          <w:sz w:val="20"/>
+          <w:szCs w:val="20"/>
+          <w:shd w:val="clear" w:color="auto" w:fill="FFFFFF"/>
+        </w:rPr>
+      </w:pPr>
+      <w:r>
+        <w:rPr>
+          <w:rFonts w:ascii="Arial" w:hAnsi="Arial" w:cs="Arial"/>
+          <w:color w:val="181818"/>
+          <w:spacing w:val="6"/>
+          <w:sz w:val="20"/>
+          <w:szCs w:val="20"/>
+          <w:shd w:val="clear" w:color="auto" w:fill="FFFFFF"/>
+        </w:rPr>
+        <w:t xml:space="preserve">Hello Dave, I just went through your post and the document you attached. Supporting enterprise data platforms using Microsoft Fabric and integrating it with Power BI and analytics workflows is something I’d be happy to help with. I have experience working with Microsoft data ecosystems, building data pipelines, designing reporting architectures, and developing Power BI dashboards that support business decision-making. I’d be happy to </w:t>
+      </w:r>
+      <w:r>
+        <w:rPr>
+          <w:rFonts w:ascii="Arial" w:hAnsi="Arial" w:cs="Arial"/>
+          <w:color w:val="181818"/>
+          <w:spacing w:val="6"/>
+          <w:sz w:val="20"/>
+          <w:szCs w:val="20"/>
+          <w:shd w:val="clear" w:color="auto" w:fill="FFFFFF"/>
+        </w:rPr>
+        <w:lastRenderedPageBreak/>
+        <w:t>discuss your Fabric environment and how I can support the platform transformation if the proposal is taken forward. Best regards, Sagar</w:t>
+      </w:r>
+    </w:p>
+    <w:p>
+      <w:pPr>
+        <w:rPr>
+          <w:rFonts w:ascii="Arial" w:hAnsi="Arial" w:cs="Arial"/>
+          <w:color w:val="181818"/>
+          <w:spacing w:val="6"/>
+          <w:sz w:val="20"/>
+          <w:szCs w:val="20"/>
+          <w:shd w:val="clear" w:color="auto" w:fill="FFFFFF"/>
+        </w:rPr>
+      </w:pPr>
+    </w:p>
+    <w:p>
+      <w:pPr>
+        <w:rPr>
+          <w:rFonts w:ascii="Arial" w:hAnsi="Arial" w:cs="Arial"/>
+          <w:color w:val="181818"/>
+          <w:spacing w:val="6"/>
+          <w:sz w:val="20"/>
+          <w:szCs w:val="20"/>
+          <w:shd w:val="clear" w:color="auto" w:fill="FFFFFF"/>
+        </w:rPr>
+      </w:pPr>
+      <w:r>
+        <w:rPr>
+          <w:rFonts w:ascii="Arial" w:hAnsi="Arial" w:cs="Arial"/>
+          <w:color w:val="181818"/>
+          <w:spacing w:val="6"/>
+          <w:sz w:val="20"/>
+          <w:szCs w:val="20"/>
+          <w:shd w:val="clear" w:color="auto" w:fill="FFFFFF"/>
+        </w:rPr>
+        <w:t>Hello, I just went through your brief, and this type of practical analytics pilot is something I’ve worked on before. I have experience turning messy Excel/CSV operational data into structured datasets and building dashboards that highlight performance, trends, and operational risks. My preferred stack for a pilot like this would be Python (pandas) &amp; SQL for data transformation, with Power BI or Looker Studio for the dashboard. I typically handle messy SKU and branch mapping by creating master mapping tables to standardize identifiers across reports. I’ve also shared examples of my dashboard work in the attachments. Happy to discuss the approach and other details further when we connect on a call. Best regards, Sagar</w:t>
+      </w:r>
+    </w:p>
+    <w:p>
+      <w:pPr>
+        <w:rPr>
+          <w:rFonts w:ascii="Arial" w:hAnsi="Arial" w:cs="Arial"/>
+          <w:color w:val="181818"/>
+          <w:spacing w:val="6"/>
+          <w:sz w:val="20"/>
+          <w:szCs w:val="20"/>
+          <w:shd w:val="clear" w:color="auto" w:fill="FFFFFF"/>
+        </w:rPr>
+      </w:pPr>
+    </w:p>
+    <w:p>
+      <w:pPr>
+        <w:rPr>
+          <w:rFonts w:ascii="Arial" w:hAnsi="Arial" w:cs="Arial"/>
+          <w:color w:val="181818"/>
+          <w:spacing w:val="6"/>
+          <w:sz w:val="20"/>
+          <w:szCs w:val="20"/>
+          <w:shd w:val="clear" w:color="auto" w:fill="FFFFFF"/>
+        </w:rPr>
+      </w:pPr>
+      <w:r>
+        <w:rPr>
+          <w:rFonts w:ascii="Arial" w:hAnsi="Arial" w:cs="Arial"/>
+          <w:color w:val="181818"/>
+          <w:spacing w:val="6"/>
+          <w:sz w:val="20"/>
+          <w:szCs w:val="20"/>
+          <w:shd w:val="clear" w:color="auto" w:fill="FFFFFF"/>
+        </w:rPr>
+        <w:t>Hello, Yes, this type of workflow automation can definitely be implemented using Power Automate with Microsoft 365 services. For example, when a specific Outlook calendar appointment is created, a Power Automate flow can automatically trigger notifications to staff through email and Microsoft Teams, while also creating related tasks in Microsoft Planner. Similarly, scanned files received through an Outlook mailbox can be automatically moved to SharePoint, renamed using client details such as name, date, time, and case number, and stored in the correct folder. I have experience building automation workflows across Outlook, Teams, SharePoint, Planner, and other Microsoft 365 tools to streamline repetitive operational tasks. Happy to discuss your requirements and the workflows in more detail.</w:t>
+      </w:r>
+    </w:p>
+    <w:p>
+      <w:pPr>
+        <w:rPr>
+          <w:rFonts w:ascii="Arial" w:hAnsi="Arial" w:cs="Arial"/>
+          <w:color w:val="181818"/>
+          <w:spacing w:val="6"/>
+          <w:sz w:val="20"/>
+          <w:szCs w:val="20"/>
+          <w:shd w:val="clear" w:color="auto" w:fill="FFFFFF"/>
+        </w:rPr>
+      </w:pPr>
+    </w:p>
+    <w:p>
+      <w:pPr>
+        <w:pStyle w:val="break"/>
+        <w:shd w:val="clear" w:color="auto" w:fill="FFFFFF"/>
+        <w:spacing w:before="0" w:beforeAutospacing="0" w:after="0" w:afterAutospacing="0" w:line="301" w:lineRule="atLeast"/>
+        <w:rPr>
+          <w:rFonts w:ascii="Arial" w:hAnsi="Arial" w:cs="Arial"/>
+          <w:color w:val="181818"/>
+          <w:spacing w:val="6"/>
+          <w:sz w:val="20"/>
+          <w:szCs w:val="20"/>
+        </w:rPr>
+      </w:pPr>
+      <w:r>
+        <w:rPr>
+          <w:rFonts w:ascii="Arial" w:hAnsi="Arial" w:cs="Arial"/>
+          <w:color w:val="181818"/>
+          <w:spacing w:val="6"/>
+          <w:sz w:val="20"/>
+          <w:szCs w:val="20"/>
+        </w:rPr>
+        <w:t xml:space="preserve">Hello, I just went through your post, and helping organizations turn data into clear and meaningful visual stories is something I enjoy working on. I have experience building charts, graphs, and dashboards that make complex data easy to understand and communicate. I’d be happy to help visualize your data around gasoline consumption, EV adoption, and climate or financial impact in a way that clearly tells the story to your audience. Please feel free to go through my work in the attachments. When would be a good time for us to connect? Best regards, Sagar </w:t>
+      </w:r>
+    </w:p>
+    <w:p>
+      <w:pPr>
+        <w:shd w:val="clear" w:color="auto" w:fill="FFFFFF"/>
+        <w:rPr>
+          <w:color w:val="181818"/>
+        </w:rPr>
+      </w:pPr>
+    </w:p>
+    <w:p>
+      <w:pPr>
+        <w:pStyle w:val="break"/>
+        <w:shd w:val="clear" w:color="auto" w:fill="FFFFFF"/>
+        <w:spacing w:before="0" w:beforeAutospacing="0" w:after="0" w:afterAutospacing="0" w:line="301" w:lineRule="atLeast"/>
+        <w:rPr>
+          <w:rFonts w:ascii="Arial" w:hAnsi="Arial" w:cs="Arial"/>
+          <w:color w:val="181818"/>
+          <w:spacing w:val="6"/>
+          <w:sz w:val="20"/>
+          <w:szCs w:val="20"/>
+        </w:rPr>
+      </w:pPr>
+      <w:r>
+        <w:rPr>
+          <w:rFonts w:ascii="Arial" w:hAnsi="Arial" w:cs="Arial"/>
+          <w:color w:val="181818"/>
+          <w:spacing w:val="6"/>
+          <w:sz w:val="20"/>
+          <w:szCs w:val="20"/>
+        </w:rPr>
+        <w:t xml:space="preserve">Hello, I just went through your post, and helping organizations turn data into clear and meaningful visual stories is something I enjoy working on. I have experience building charts, graphs, and dashboards that make complex data easy to understand and communicate. I’d be happy to help visualize your data around gasoline consumption, EV adoption, and climate or financial impact in a way that clearly tells the story to your audience. Please feel free to go through my work in the attachments. When would be a good time for us to connect? Best regards, Sagar </w:t>
+      </w:r>
+    </w:p>
+    <w:p>
+      <w:pPr>
+        <w:shd w:val="clear" w:color="auto" w:fill="FFFFFF"/>
+        <w:rPr>
+          <w:rFonts w:ascii="Arial" w:hAnsi="Arial" w:cs="Arial"/>
+          <w:color w:val="181818"/>
+          <w:spacing w:val="6"/>
+          <w:sz w:val="20"/>
+          <w:szCs w:val="20"/>
+        </w:rPr>
+      </w:pPr>
+    </w:p>
+    <w:p>
+      <w:pPr>
+        <w:shd w:val="clear" w:color="auto" w:fill="FFFFFF"/>
+        <w:rPr>
+          <w:rFonts w:ascii="Arial" w:hAnsi="Arial" w:cs="Arial"/>
+          <w:color w:val="181818"/>
+          <w:spacing w:val="6"/>
+          <w:sz w:val="20"/>
+          <w:szCs w:val="20"/>
+          <w:shd w:val="clear" w:color="auto" w:fill="FFFFFF"/>
+        </w:rPr>
+      </w:pPr>
+      <w:r>
+        <w:rPr>
+          <w:rFonts w:ascii="Arial" w:hAnsi="Arial" w:cs="Arial"/>
+          <w:color w:val="181818"/>
+          <w:spacing w:val="6"/>
+          <w:sz w:val="20"/>
+          <w:szCs w:val="20"/>
+          <w:shd w:val="clear" w:color="auto" w:fill="FFFFFF"/>
+        </w:rPr>
+        <w:lastRenderedPageBreak/>
+        <w:t>Hello Massimo and Team, I just went through your post, and streamlining onboarding and document workflows is something I’d be happy to help with. I have experience using DocuSign templates, variables, and workflow automation to reduce manual steps and improve the user experience. For this process, I would structure templates with shared variables so users enter their information once and it auto-populates across all documents within a single streamlined signing flow. Please feel free to go through my work in the attachments. When would be a good time for us to connect? Best regards, Sagar</w:t>
+      </w:r>
+    </w:p>
+    <w:p>
+      <w:pPr>
+        <w:shd w:val="clear" w:color="auto" w:fill="FFFFFF"/>
+        <w:rPr>
+          <w:rFonts w:ascii="Arial" w:hAnsi="Arial" w:cs="Arial"/>
+          <w:color w:val="181818"/>
+          <w:spacing w:val="6"/>
+          <w:sz w:val="20"/>
+          <w:szCs w:val="20"/>
+          <w:shd w:val="clear" w:color="auto" w:fill="FFFFFF"/>
+        </w:rPr>
+      </w:pPr>
+    </w:p>
+    <w:p>
+      <w:pPr>
+        <w:shd w:val="clear" w:color="auto" w:fill="FFFFFF"/>
+        <w:rPr>
+          <w:rFonts w:ascii="Arial" w:hAnsi="Arial" w:cs="Arial"/>
+          <w:color w:val="181818"/>
+          <w:spacing w:val="6"/>
+          <w:sz w:val="20"/>
+          <w:szCs w:val="20"/>
+          <w:shd w:val="clear" w:color="auto" w:fill="FFFFFF"/>
+        </w:rPr>
+      </w:pPr>
+      <w:r>
+        <w:rPr>
+          <w:rFonts w:ascii="Arial" w:hAnsi="Arial" w:cs="Arial"/>
+          <w:color w:val="181818"/>
+          <w:spacing w:val="6"/>
+          <w:sz w:val="20"/>
+          <w:szCs w:val="20"/>
+          <w:shd w:val="clear" w:color="auto" w:fill="FFFFFF"/>
+        </w:rPr>
+        <w:t>Hello, I just went through your post, and rebuilding reporting decks into clean Looker Studio dashboards is something I’ve worked on before. I can help translate your Google Slides structure into a polished, client-ready Looker Studio report with clear charts, scorecards, and layouts that can be easily updated each month. Please feel free to review my dashboard examples in the attachments. I’m available to start immediately and can begin working on this right away. When would be a good time for us to connect? Best regards, Sagar</w:t>
+      </w:r>
+    </w:p>
+    <w:p>
+      <w:pPr>
+        <w:shd w:val="clear" w:color="auto" w:fill="FFFFFF"/>
+        <w:rPr>
+          <w:color w:val="181818"/>
         </w:rPr>
       </w:pPr>
     </w:p>

</xml_diff>

<commit_message>
increase in knowlwdge base(kb)
</commit_message>
<xml_diff>
--- a/data/knowledge_base/PowerBI_Healthcare_Proposal.docx
+++ b/data/knowledge_base/PowerBI_Healthcare_Proposal.docx
@@ -1593,6 +1593,1166 @@
           <w:color w:val="181818"/>
         </w:rPr>
       </w:pPr>
+    </w:p>
+    <w:p>
+      <w:pPr>
+        <w:pStyle w:val="NormalWeb"/>
+      </w:pPr>
+      <w:r>
+        <w:rPr>
+          <w:rStyle w:val="Strong"/>
+          <w:b w:val="0"/>
+        </w:rPr>
+        <w:t>Hey there,</w:t>
+      </w:r>
+    </w:p>
+    <w:p>
+      <w:pPr>
+        <w:pStyle w:val="NormalWeb"/>
+      </w:pPr>
+      <w:r>
+        <w:t>I just went through your post, and it sounds like you need a BI expert to fix urgent bugs in Power BI/Tableau and guide your BI strategy across SQL and cloud platforms like Snowflake, BigQuery, and Redshift. I’d love to help.</w:t>
+      </w:r>
+    </w:p>
+    <w:p>
+      <w:pPr>
+        <w:pStyle w:val="NormalWeb"/>
+      </w:pPr>
+      <w:r>
+        <w:t>I’ve resolved complex BI issues, optimized dashboards for performance, and automated reporting pipelines so executives get real-time, accurate insights. I specialize in interactive, drill-down dashboards using DAX, Power Query, and SQL, ensuring reporting is both actionable and aligned with business goals.</w:t>
+      </w:r>
+    </w:p>
+    <w:p>
+      <w:pPr>
+        <w:pStyle w:val="NormalWeb"/>
+      </w:pPr>
+      <w:r>
+        <w:t>Before diving in, I’d love to understand your current setup—what bugs are affecting your dashboards, how your data pipelines are structured, and which KPIs matter most. Once I know, I can walk you through my approach to fixing issues, improving performance, and creating scalable reporting solutions.</w:t>
+      </w:r>
+    </w:p>
+    <w:p>
+      <w:pPr>
+        <w:pStyle w:val="NormalWeb"/>
+      </w:pPr>
+      <w:r>
+        <w:t>Would you be open to a quick call to discuss?</w:t>
+      </w:r>
+    </w:p>
+    <w:p>
+      <w:pPr>
+        <w:pStyle w:val="NormalWeb"/>
+      </w:pPr>
+      <w:r>
+        <w:rPr>
+          <w:rStyle w:val="Strong"/>
+          <w:b w:val="0"/>
+        </w:rPr>
+        <w:t>Warm regards,</w:t>
+      </w:r>
+      <w:r>
+        <w:br/>
+        <w:t>Sagar</w:t>
+      </w:r>
+    </w:p>
+    <w:p>
+      <w:pPr>
+        <w:pStyle w:val="NormalWeb"/>
+      </w:pPr>
+      <w:r>
+        <w:rPr>
+          <w:rStyle w:val="Strong"/>
+          <w:b w:val="0"/>
+        </w:rPr>
+        <w:t>Hey there,</w:t>
+      </w:r>
+    </w:p>
+    <w:p>
+      <w:pPr>
+        <w:pStyle w:val="NormalWeb"/>
+      </w:pPr>
+      <w:r>
+        <w:t>I just went through your post, and it sounds like you’re looking for a Power BI developer to turn complex data into clean, executive-ready dashboards. I’d love to help.</w:t>
+      </w:r>
+    </w:p>
+    <w:p>
+      <w:pPr>
+        <w:pStyle w:val="NormalWeb"/>
+      </w:pPr>
+      <w:r>
+        <w:t xml:space="preserve">I’ve built dashboards and robust data models for real clients, leveraging DAX and best visualization practices to deliver insights that are accurate, actionable, and easy to </w:t>
+      </w:r>
+      <w:r>
+        <w:lastRenderedPageBreak/>
+        <w:t>understand. I focus on translating business requirements into reports that executives and teams can rely on for decision-making.</w:t>
+      </w:r>
+    </w:p>
+    <w:p>
+      <w:pPr>
+        <w:pStyle w:val="NormalWeb"/>
+      </w:pPr>
+      <w:r>
+        <w:t>I’d love to see your current data and reporting needs so I can suggest the best approach for dashboard design, data modeling, and visualization. Once I understand the setup, I can share examples of similar dashboards I’ve created and how I’d structure yours for clarity and impact.</w:t>
+      </w:r>
+    </w:p>
+    <w:p>
+      <w:pPr>
+        <w:pStyle w:val="NormalWeb"/>
+      </w:pPr>
+      <w:r>
+        <w:t>Would you be open to a quick call to discuss further?</w:t>
+      </w:r>
+    </w:p>
+    <w:p>
+      <w:pPr>
+        <w:pStyle w:val="NormalWeb"/>
+      </w:pPr>
+      <w:r>
+        <w:rPr>
+          <w:rStyle w:val="Strong"/>
+          <w:b w:val="0"/>
+        </w:rPr>
+        <w:t>Warm regards,</w:t>
+      </w:r>
+      <w:r>
+        <w:br/>
+        <w:t>Sagar</w:t>
+      </w:r>
+    </w:p>
+    <w:p/>
+    <w:p>
+      <w:pPr>
+        <w:pStyle w:val="NormalWeb"/>
+      </w:pPr>
+      <w:r>
+        <w:rPr>
+          <w:rStyle w:val="Strong"/>
+          <w:b w:val="0"/>
+        </w:rPr>
+        <w:t>Hey there,</w:t>
+      </w:r>
+    </w:p>
+    <w:p>
+      <w:pPr>
+        <w:pStyle w:val="NormalWeb"/>
+      </w:pPr>
+      <w:r>
+        <w:t>I just went through your post, and it sounds like you’re looking for a BI expert to quickly fix serious bugs in Power BI/Tableau dashboards while also providing guidance on BI strategy across SQL and cloud platforms like Snowflake, BigQuery, and Redshift. I’d love to help.</w:t>
+      </w:r>
+    </w:p>
+    <w:p>
+      <w:pPr>
+        <w:pStyle w:val="NormalWeb"/>
+      </w:pPr>
+      <w:r>
+        <w:t>I’ve handled similar projects where I resolved complex BI issues, optimized dashboards for performance, and automated reporting pipelines so executives get accurate, real-time insights. I specialize in building interactive, drill-down dashboards using DAX, Power Query, and SQL, ensuring reporting is both actionable and aligned with business goals.</w:t>
+      </w:r>
+    </w:p>
+    <w:p>
+      <w:pPr>
+        <w:pStyle w:val="NormalWeb"/>
+      </w:pPr>
+      <w:r>
+        <w:t>I’d love to understand your current setup—what bugs are affecting your dashboards, how your data pipelines are structured, and which KPIs matter most. Once I have a clear picture, I can walk you through my approach for fixing issues, improving performance, and creating scalable reporting solutions.</w:t>
+      </w:r>
+    </w:p>
+    <w:p>
+      <w:pPr>
+        <w:pStyle w:val="NormalWeb"/>
+      </w:pPr>
+      <w:r>
+        <w:t>Would you be open to a quick call to discuss this further?</w:t>
+      </w:r>
+    </w:p>
+    <w:p>
+      <w:pPr>
+        <w:pStyle w:val="NormalWeb"/>
+      </w:pPr>
+      <w:r>
+        <w:rPr>
+          <w:rStyle w:val="Strong"/>
+          <w:b w:val="0"/>
+        </w:rPr>
+        <w:t>Warm regards,</w:t>
+      </w:r>
+      <w:r>
+        <w:br/>
+        <w:t>Sagar</w:t>
+      </w:r>
+    </w:p>
+    <w:p>
+      <w:pPr>
+        <w:pStyle w:val="NormalWeb"/>
+      </w:pPr>
+      <w:r>
+        <w:rPr>
+          <w:rStyle w:val="Strong"/>
+          <w:b w:val="0"/>
+        </w:rPr>
+        <w:t>Hey there,</w:t>
+      </w:r>
+    </w:p>
+    <w:p>
+      <w:pPr>
+        <w:pStyle w:val="NormalWeb"/>
+      </w:pPr>
+      <w:r>
+        <w:t>I just went through your post, and it sounds like you’re looking for a BI expert to quickly fix serious bugs in Power BI/Tableau dashboards while also providing guidance on BI strategy across SQL and cloud platforms like Snowflake, BigQuery, and Redshift. I’d love to help.</w:t>
+      </w:r>
+    </w:p>
+    <w:p>
+      <w:pPr>
+        <w:pStyle w:val="NormalWeb"/>
+      </w:pPr>
+      <w:r>
+        <w:t xml:space="preserve">I’ve handled similar projects where I resolved complex BI issues, optimized dashboards for performance, and automated reporting pipelines so executives get accurate, real-time </w:t>
+      </w:r>
+      <w:r>
+        <w:lastRenderedPageBreak/>
+        <w:t>insights. I specialize in building interactive, drill-down dashboards using DAX, Power Query, and SQL, ensuring reporting is both actionable and aligned with business goals.</w:t>
+      </w:r>
+    </w:p>
+    <w:p>
+      <w:pPr>
+        <w:pStyle w:val="NormalWeb"/>
+      </w:pPr>
+      <w:r>
+        <w:t>I’d love to understand your current setup—what bugs are affecting your dashboards, how your data pipelines are structured, and which KPIs matter most. Once I have a clear picture, I can walk you through my approach for fixing issues, improving performance, and creating scalable reporting solutions.</w:t>
+      </w:r>
+    </w:p>
+    <w:p>
+      <w:pPr>
+        <w:pStyle w:val="NormalWeb"/>
+      </w:pPr>
+      <w:r>
+        <w:t>Would you be open to a quick call to discuss this further?</w:t>
+      </w:r>
+    </w:p>
+    <w:p>
+      <w:pPr>
+        <w:pStyle w:val="NormalWeb"/>
+      </w:pPr>
+      <w:r>
+        <w:rPr>
+          <w:rStyle w:val="Strong"/>
+          <w:b w:val="0"/>
+        </w:rPr>
+        <w:t>Warm regards,</w:t>
+      </w:r>
+      <w:r>
+        <w:br/>
+        <w:t>Sagar</w:t>
+      </w:r>
+    </w:p>
+    <w:p>
+      <w:pPr>
+        <w:pStyle w:val="NormalWeb"/>
+      </w:pPr>
+      <w:r>
+        <w:rPr>
+          <w:rStyle w:val="Strong"/>
+          <w:b w:val="0"/>
+        </w:rPr>
+        <w:t>Hey there,</w:t>
+      </w:r>
+    </w:p>
+    <w:p>
+      <w:pPr>
+        <w:pStyle w:val="NormalWeb"/>
+      </w:pPr>
+      <w:r>
+        <w:t>I just went through your post, and it sounds like you’re looking for someone to build a comprehensive dashboard in Looker Studio/BigQuery or Power BI, pulling data from ServiceTitan and Google Ads. I’d love to help.</w:t>
+      </w:r>
+    </w:p>
+    <w:p>
+      <w:pPr>
+        <w:pStyle w:val="NormalWeb"/>
+      </w:pPr>
+      <w:r>
+        <w:t>I’ve built similar dashboards that combine operational and marketing data, creating tabs for sales performance, revenue tracking vs targets, job completion metrics, and ad campaign performance. I focus on designing dashboards that are interactive, executive-ready, and make complex data actionable at a glance. Whether it’s calculating close rates, tracking hours sold vs completed, or visualizing ROAS and keyword-level revenue, I ensure the insights are clear and reliable.</w:t>
+      </w:r>
+    </w:p>
+    <w:p>
+      <w:pPr>
+        <w:pStyle w:val="NormalWeb"/>
+      </w:pPr>
+      <w:r>
+        <w:t>I’d love to understand your current data setup—how ServiceTitan and Google Ads data are structured—and your key reporting priorities so I can propose the cleanest, most automated solution for your team.</w:t>
+      </w:r>
+    </w:p>
+    <w:p>
+      <w:pPr>
+        <w:pStyle w:val="NormalWeb"/>
+      </w:pPr>
+      <w:r>
+        <w:t>Would you be open to a quick call to discuss?</w:t>
+      </w:r>
+    </w:p>
+    <w:p>
+      <w:pPr>
+        <w:pStyle w:val="NormalWeb"/>
+      </w:pPr>
+      <w:r>
+        <w:rPr>
+          <w:rStyle w:val="Strong"/>
+          <w:b w:val="0"/>
+        </w:rPr>
+        <w:t>Warm regards,</w:t>
+      </w:r>
+      <w:r>
+        <w:br/>
+        <w:t>Sagar</w:t>
+      </w:r>
+    </w:p>
+    <w:p>
+      <w:pPr>
+        <w:pStyle w:val="NormalWeb"/>
+      </w:pPr>
+      <w:r>
+        <w:rPr>
+          <w:rStyle w:val="Strong"/>
+          <w:b w:val="0"/>
+        </w:rPr>
+        <w:t>Hey there,</w:t>
+      </w:r>
+    </w:p>
+    <w:p>
+      <w:pPr>
+        <w:pStyle w:val="NormalWeb"/>
+      </w:pPr>
+      <w:r>
+        <w:t>I just went through your post, and it sounds like you’re looking for someone to build a comprehensive dashboard in Looker Studio/BigQuery or Power BI, pulling data from ServiceTitan and Google Ads. I’d love to help.</w:t>
+      </w:r>
+    </w:p>
+    <w:p>
+      <w:pPr>
+        <w:pStyle w:val="NormalWeb"/>
+      </w:pPr>
+      <w:r>
+        <w:t xml:space="preserve">I’ve built similar dashboards that combine operational and marketing data, creating tabs for sales performance, revenue tracking vs targets, job completion metrics, and ad campaign performance. I focus on designing dashboards that are interactive, executive-ready, and make complex data actionable at a glance. Whether it’s calculating close rates, </w:t>
+      </w:r>
+      <w:r>
+        <w:lastRenderedPageBreak/>
+        <w:t>tracking hours sold vs completed, or visualizing ROAS and keyword-level revenue, I ensure the insights are clear and reliable.</w:t>
+      </w:r>
+    </w:p>
+    <w:p>
+      <w:pPr>
+        <w:pStyle w:val="NormalWeb"/>
+      </w:pPr>
+      <w:r>
+        <w:t>I’d love to understand your current data setup—how ServiceTitan and Google Ads data are structured—and your key reporting priorities so I can propose the cleanest, most automated solution for your team.</w:t>
+      </w:r>
+    </w:p>
+    <w:p>
+      <w:pPr>
+        <w:pStyle w:val="NormalWeb"/>
+      </w:pPr>
+      <w:r>
+        <w:t>Would you be open to a quick call to discuss?</w:t>
+      </w:r>
+    </w:p>
+    <w:p>
+      <w:pPr>
+        <w:pStyle w:val="NormalWeb"/>
+      </w:pPr>
+      <w:r>
+        <w:rPr>
+          <w:rStyle w:val="Strong"/>
+          <w:b w:val="0"/>
+        </w:rPr>
+        <w:t>Warm regards,</w:t>
+      </w:r>
+      <w:r>
+        <w:br/>
+        <w:t>Sagar</w:t>
+      </w:r>
+    </w:p>
+    <w:p>
+      <w:pPr>
+        <w:pStyle w:val="NormalWeb"/>
+      </w:pPr>
+      <w:r>
+        <w:rPr>
+          <w:rStyle w:val="Strong"/>
+          <w:b w:val="0"/>
+        </w:rPr>
+        <w:t>Hey there,</w:t>
+      </w:r>
+    </w:p>
+    <w:p>
+      <w:pPr>
+        <w:pStyle w:val="NormalWeb"/>
+      </w:pPr>
+      <w:r>
+        <w:t>I just went through your post, and it sounds like you need a dashboard in Looker Studio/BigQuery or Power BI that pulls data from ServiceTitan and Google Ads. I’d love to help.</w:t>
+      </w:r>
+    </w:p>
+    <w:p>
+      <w:pPr>
+        <w:pStyle w:val="NormalWeb"/>
+      </w:pPr>
+      <w:r>
+        <w:t>I’ve built similar dashboards combining operational and marketing data—sales leaderboards, revenue vs targets, hours sold vs completed, and Google Ads performance including ROAS and keyword-level revenue. I focus on making dashboards interactive, executive-ready, and easy to act on.</w:t>
+      </w:r>
+    </w:p>
+    <w:p>
+      <w:pPr>
+        <w:pStyle w:val="NormalWeb"/>
+      </w:pPr>
+      <w:r>
+        <w:t>I’d love to understand your current data setup and reporting priorities so I can propose the cleanest, most automated solution for your team.</w:t>
+      </w:r>
+    </w:p>
+    <w:p>
+      <w:pPr>
+        <w:pStyle w:val="NormalWeb"/>
+      </w:pPr>
+      <w:r>
+        <w:t>Would you be open to a quick call to discuss?</w:t>
+      </w:r>
+    </w:p>
+    <w:p>
+      <w:pPr>
+        <w:pStyle w:val="NormalWeb"/>
+      </w:pPr>
+      <w:r>
+        <w:rPr>
+          <w:rStyle w:val="Strong"/>
+          <w:b w:val="0"/>
+        </w:rPr>
+        <w:t>Warm regards,</w:t>
+      </w:r>
+      <w:r>
+        <w:br/>
+        <w:t>Sagar</w:t>
+      </w:r>
+    </w:p>
+    <w:p>
+      <w:pPr>
+        <w:pStyle w:val="NormalWeb"/>
+      </w:pPr>
+      <w:r>
+        <w:rPr>
+          <w:rStyle w:val="Strong"/>
+          <w:b w:val="0"/>
+        </w:rPr>
+        <w:t>Hey there,</w:t>
+      </w:r>
+    </w:p>
+    <w:p>
+      <w:pPr>
+        <w:pStyle w:val="NormalWeb"/>
+      </w:pPr>
+      <w:r>
+        <w:t>I just went through your post, and it sounds like you’re looking for a Power Platform expert to build custom apps, create insightful Power BI/Power Pages visuals, and automate workflows with Power Automate. I’d love to help.</w:t>
+      </w:r>
+    </w:p>
+    <w:p>
+      <w:pPr>
+        <w:pStyle w:val="NormalWeb"/>
+      </w:pPr>
+      <w:r>
+        <w:t>I’ve worked on similar projects where I designed efficient, user-friendly apps, built dashboards and reports that deliver actionable insights, and automated processes to save time and reduce errors. I focus on making solutions both technically robust and easy for teams to adopt.</w:t>
+      </w:r>
+    </w:p>
+    <w:p>
+      <w:pPr>
+        <w:pStyle w:val="NormalWeb"/>
+      </w:pPr>
+      <w:r>
+        <w:t>I’d love to understand your current setup and goals so I can share how I’d approach app development, reporting, and automation for your team.</w:t>
+      </w:r>
+    </w:p>
+    <w:p>
+      <w:pPr>
+        <w:pStyle w:val="NormalWeb"/>
+      </w:pPr>
+      <w:r>
+        <w:t>Would you be open to a quick call to discuss?</w:t>
+      </w:r>
+    </w:p>
+    <w:p>
+      <w:pPr>
+        <w:pStyle w:val="NormalWeb"/>
+      </w:pPr>
+      <w:r>
+        <w:rPr>
+          <w:rStyle w:val="Strong"/>
+          <w:b w:val="0"/>
+        </w:rPr>
+        <w:lastRenderedPageBreak/>
+        <w:t>Warm regards,</w:t>
+      </w:r>
+      <w:r>
+        <w:br/>
+        <w:t>Sagar</w:t>
+      </w:r>
+    </w:p>
+    <w:p>
+      <w:pPr>
+        <w:pStyle w:val="NormalWeb"/>
+      </w:pPr>
+      <w:r>
+        <w:rPr>
+          <w:rStyle w:val="Strong"/>
+          <w:b w:val="0"/>
+        </w:rPr>
+        <w:t>Hey ,</w:t>
+      </w:r>
+    </w:p>
+    <w:p>
+      <w:pPr>
+        <w:pStyle w:val="NormalWeb"/>
+      </w:pPr>
+      <w:r>
+        <w:t>I just went through your post, and it sounds like you’re looking for a Looker Studio expert to build both internal management and client-facing dashboards from Google Sheets data. I’d love to help.</w:t>
+      </w:r>
+    </w:p>
+    <w:p>
+      <w:pPr>
+        <w:pStyle w:val="NormalWeb"/>
+      </w:pPr>
+      <w:r>
+        <w:t>I’ve worked on projects where I built clean, interactive dashboards in Looker Studio, connecting Google Sheets and other sources to deliver actionable insights. My focus is on creating dashboards that are easy to use, visually clear, and provide the key metrics your team or clients need.</w:t>
+      </w:r>
+    </w:p>
+    <w:p>
+      <w:pPr>
+        <w:pStyle w:val="NormalWeb"/>
+      </w:pPr>
+      <w:r>
+        <w:t>I’d love to understand your current data setup and reporting priorities so I can suggest the best approach for your dashboards.</w:t>
+      </w:r>
+    </w:p>
+    <w:p>
+      <w:pPr>
+        <w:pStyle w:val="NormalWeb"/>
+      </w:pPr>
+      <w:r>
+        <w:t>Would you be open to a quick call to discuss?</w:t>
+      </w:r>
+    </w:p>
+    <w:p>
+      <w:pPr>
+        <w:pStyle w:val="NormalWeb"/>
+      </w:pPr>
+      <w:r>
+        <w:rPr>
+          <w:rStyle w:val="Strong"/>
+          <w:b w:val="0"/>
+        </w:rPr>
+        <w:t>Warm regards,</w:t>
+      </w:r>
+      <w:r>
+        <w:br/>
+        <w:t>Sagar</w:t>
+      </w:r>
+    </w:p>
+    <w:p>
+      <w:pPr>
+        <w:pStyle w:val="NormalWeb"/>
+      </w:pPr>
+      <w:r>
+        <w:rPr>
+          <w:rStyle w:val="Strong"/>
+          <w:b w:val="0"/>
+        </w:rPr>
+        <w:t>Hey there,</w:t>
+      </w:r>
+    </w:p>
+    <w:p>
+      <w:pPr>
+        <w:pStyle w:val="NormalWeb"/>
+      </w:pPr>
+      <w:r>
+        <w:t>I just went through your post, and it sounds like you’re looking for a Power BI expert to build a dynamic cash flow forecasting dashboard integrating data from Acumatica, Excel, PDFs, and emails. I’d love to help.</w:t>
+      </w:r>
+    </w:p>
+    <w:p>
+      <w:pPr>
+        <w:pStyle w:val="NormalWeb"/>
+      </w:pPr>
+      <w:r>
+        <w:t>I’ve built similar financial dashboards where I transformed raw data from multiple sources into actionable insights for management. I focus on clean, interactive visuals, reliable calculations, and automation wherever possible so teams can monitor cash flow and make informed decisions without manual effort.</w:t>
+      </w:r>
+    </w:p>
+    <w:p>
+      <w:pPr>
+        <w:pStyle w:val="NormalWeb"/>
+      </w:pPr>
+      <w:r>
+        <w:t>I’d love to understand your current data setup and key forecasting metrics so I can propose the most efficient and accurate dashboard design.</w:t>
+      </w:r>
+    </w:p>
+    <w:p>
+      <w:pPr>
+        <w:pStyle w:val="NormalWeb"/>
+      </w:pPr>
+      <w:r>
+        <w:t>Would you be open to a quick call to discuss?</w:t>
+      </w:r>
+    </w:p>
+    <w:p>
+      <w:pPr>
+        <w:pStyle w:val="NormalWeb"/>
+      </w:pPr>
+      <w:r>
+        <w:rPr>
+          <w:rStyle w:val="Strong"/>
+          <w:b w:val="0"/>
+        </w:rPr>
+        <w:t>Warm regards,</w:t>
+      </w:r>
+      <w:r>
+        <w:br/>
+        <w:t>Sagar</w:t>
+      </w:r>
+    </w:p>
+    <w:p>
+      <w:pPr>
+        <w:pStyle w:val="NormalWeb"/>
+      </w:pPr>
+      <w:r>
+        <w:rPr>
+          <w:rStyle w:val="Strong"/>
+          <w:b w:val="0"/>
+        </w:rPr>
+        <w:t>Hey there,</w:t>
+      </w:r>
+    </w:p>
+    <w:p>
+      <w:pPr>
+        <w:pStyle w:val="NormalWeb"/>
+      </w:pPr>
+      <w:r>
+        <w:t>I just went through your post, and it sounds like you’re looking for someone to build a Power Pages portal for your cleaning company to manage work orders for both clients and cleaners. I’d love to help.</w:t>
+      </w:r>
+    </w:p>
+    <w:p>
+      <w:pPr>
+        <w:pStyle w:val="NormalWeb"/>
+      </w:pPr>
+      <w:r>
+        <w:lastRenderedPageBreak/>
+        <w:t xml:space="preserve">I’ve worked on similar projects where I developed Power Pages portals integrated with </w:t>
+      </w:r>
+      <w:r>
+        <w:rPr>
+          <w:rStyle w:val="Strong"/>
+          <w:b w:val="0"/>
+        </w:rPr>
+        <w:t>Power Automate</w:t>
+      </w:r>
+      <w:r>
+        <w:t xml:space="preserve"> to streamline workflows, automate notifications, and manage user interactions efficiently. My focus is on building user-friendly, reliable solutions that make operations smoother for both staff and clients.</w:t>
+      </w:r>
+    </w:p>
+    <w:p>
+      <w:pPr>
+        <w:pStyle w:val="NormalWeb"/>
+      </w:pPr>
+      <w:r>
+        <w:t>I’d love to understand your current processes and requirements so I can propose the most efficient portal setup for work order management.</w:t>
+      </w:r>
+    </w:p>
+    <w:p>
+      <w:pPr>
+        <w:pStyle w:val="NormalWeb"/>
+      </w:pPr>
+      <w:r>
+        <w:t>Would you be open to a quick call to discuss?</w:t>
+      </w:r>
+    </w:p>
+    <w:p>
+      <w:pPr>
+        <w:pStyle w:val="NormalWeb"/>
+      </w:pPr>
+      <w:r>
+        <w:rPr>
+          <w:rStyle w:val="Strong"/>
+          <w:b w:val="0"/>
+        </w:rPr>
+        <w:t>Warm regards,</w:t>
+      </w:r>
+      <w:r>
+        <w:br/>
+        <w:t>Sagar</w:t>
+      </w:r>
+    </w:p>
+    <w:p>
+      <w:pPr>
+        <w:pStyle w:val="NormalWeb"/>
+      </w:pPr>
+      <w:r>
+        <w:rPr>
+          <w:rStyle w:val="Strong"/>
+          <w:b w:val="0"/>
+        </w:rPr>
+        <w:t>Hey there,</w:t>
+      </w:r>
+    </w:p>
+    <w:p>
+      <w:pPr>
+        <w:pStyle w:val="NormalWeb"/>
+      </w:pPr>
+      <w:r>
+        <w:t>I just went through your post, and it sounds like you’re looking for someone to automate the process of saving and formatting spreadsheets using Power Automate for your monthly and quarterly workflows. I’d love to help.</w:t>
+      </w:r>
+    </w:p>
+    <w:p>
+      <w:pPr>
+        <w:pStyle w:val="NormalWeb"/>
+      </w:pPr>
+      <w:r>
+        <w:t>I’ve worked on similar automation projects where I built Power Automate flows to process Excel files, handle data formatting, and streamline recurring reporting tasks. My focus is always on making workflows reliable and efficient so teams can avoid manual work while ensuring the data is processed accurately.</w:t>
+      </w:r>
+    </w:p>
+    <w:p>
+      <w:pPr>
+        <w:pStyle w:val="NormalWeb"/>
+      </w:pPr>
+      <w:r>
+        <w:t>I’d love to understand your current spreadsheet structure and the exact steps involved in the monthly and quarterly process so I can design a workflow that handles it smoothly.</w:t>
+      </w:r>
+    </w:p>
+    <w:p>
+      <w:pPr>
+        <w:pStyle w:val="NormalWeb"/>
+      </w:pPr>
+      <w:r>
+        <w:t>Would you be open to a quick call to discuss?</w:t>
+      </w:r>
+    </w:p>
+    <w:p>
+      <w:pPr>
+        <w:pStyle w:val="NormalWeb"/>
+      </w:pPr>
+      <w:r>
+        <w:rPr>
+          <w:rStyle w:val="Strong"/>
+          <w:b w:val="0"/>
+        </w:rPr>
+        <w:t>Warm regards,</w:t>
+      </w:r>
+      <w:r>
+        <w:br/>
+        <w:t>Sagar</w:t>
+      </w:r>
+    </w:p>
+    <w:p>
+      <w:pPr>
+        <w:pStyle w:val="NormalWeb"/>
+      </w:pPr>
+      <w:r>
+        <w:rPr>
+          <w:rStyle w:val="Strong"/>
+          <w:b w:val="0"/>
+        </w:rPr>
+        <w:t>Hey there,</w:t>
+      </w:r>
+    </w:p>
+    <w:p>
+      <w:pPr>
+        <w:pStyle w:val="NormalWeb"/>
+      </w:pPr>
+      <w:r>
+        <w:t>I just went through your post, and it sounds like you’re looking for someone who can design reliable Power Automate workflows integrated with SharePoint while ensuring proper error handling, logging, and long-term maintainability. I’d love to help.</w:t>
+      </w:r>
+    </w:p>
+    <w:p>
+      <w:pPr>
+        <w:pStyle w:val="NormalWeb"/>
+      </w:pPr>
+      <w:r>
+        <w:t>I’ve worked on similar projects where I built Power Automate flows to automate document processing, approvals, and data updates within SharePoint. These solutions included structured error handling, logging failures back to tracking columns, and creating workflows that teams can rely on without constant manual intervention.</w:t>
+      </w:r>
+    </w:p>
+    <w:p>
+      <w:pPr>
+        <w:pStyle w:val="NormalWeb"/>
+      </w:pPr>
+      <w:r>
+        <w:t>I’m comfortable working within tight turnaround timelines and would be happy to support this as a long-term engagement while continuously improving the workflows as your processes evolve.</w:t>
+      </w:r>
+    </w:p>
+    <w:p>
+      <w:pPr>
+        <w:pStyle w:val="NormalWeb"/>
+      </w:pPr>
+      <w:r>
+        <w:lastRenderedPageBreak/>
+        <w:t>I’d also be happy to share examples of similar Power Automate + SharePoint workflows I’ve built.</w:t>
+      </w:r>
+    </w:p>
+    <w:p>
+      <w:pPr>
+        <w:pStyle w:val="NormalWeb"/>
+      </w:pPr>
+      <w:r>
+        <w:t>Would you be open to a quick call to discuss?</w:t>
+      </w:r>
+    </w:p>
+    <w:p>
+      <w:pPr>
+        <w:pStyle w:val="NormalWeb"/>
+      </w:pPr>
+      <w:r>
+        <w:rPr>
+          <w:rStyle w:val="Strong"/>
+          <w:b w:val="0"/>
+        </w:rPr>
+        <w:t>Warm regards,</w:t>
+      </w:r>
+      <w:r>
+        <w:br/>
+        <w:t>Sagar</w:t>
+      </w:r>
+    </w:p>
+    <w:p>
+      <w:pPr>
+        <w:pStyle w:val="NormalWeb"/>
+      </w:pPr>
+      <w:r>
+        <w:rPr>
+          <w:rStyle w:val="Strong"/>
+          <w:b w:val="0"/>
+        </w:rPr>
+        <w:t>Hey there,</w:t>
+      </w:r>
+    </w:p>
+    <w:p>
+      <w:pPr>
+        <w:pStyle w:val="NormalWeb"/>
+      </w:pPr>
+      <w:r>
+        <w:t>I just went through your post, and it sounds like you’re looking for someone who can review and enhance your existing Power BI dashboards to improve visuals, data models, and overall usability. I’d love to help.</w:t>
+      </w:r>
+    </w:p>
+    <w:p>
+      <w:pPr>
+        <w:pStyle w:val="NormalWeb"/>
+      </w:pPr>
+      <w:r>
+        <w:t>I’ve worked on similar projects where I analyzed existing dashboards, optimized data models, improved DAX calculations, and redesigned visuals so the insights are clearer and easier for teams to act on. My focus is always on making dashboards both visually clean and technically efficient so users can quickly understand the story behind the data.</w:t>
+      </w:r>
+    </w:p>
+    <w:p>
+      <w:pPr>
+        <w:pStyle w:val="NormalWeb"/>
+      </w:pPr>
+      <w:r>
+        <w:t>I’d love to take a look at your current dashboards and understand what challenges you’re facing so I can suggest improvements and best practices.</w:t>
+      </w:r>
+    </w:p>
+    <w:p>
+      <w:pPr>
+        <w:pStyle w:val="NormalWeb"/>
+      </w:pPr>
+      <w:r>
+        <w:t>Would you be open to a quick call to discuss?</w:t>
+      </w:r>
+    </w:p>
+    <w:p>
+      <w:pPr>
+        <w:pStyle w:val="NormalWeb"/>
+      </w:pPr>
+      <w:r>
+        <w:rPr>
+          <w:rStyle w:val="Strong"/>
+          <w:b w:val="0"/>
+        </w:rPr>
+        <w:t>Warm regards,</w:t>
+      </w:r>
+      <w:r>
+        <w:br/>
+        <w:t>Sagar</w:t>
+      </w:r>
+    </w:p>
+    <w:p>
+      <w:pPr>
+        <w:pStyle w:val="NormalWeb"/>
+      </w:pPr>
+      <w:r>
+        <w:rPr>
+          <w:rStyle w:val="Strong"/>
+          <w:b w:val="0"/>
+        </w:rPr>
+        <w:t>Hey there,</w:t>
+      </w:r>
+    </w:p>
+    <w:p>
+      <w:pPr>
+        <w:pStyle w:val="NormalWeb"/>
+      </w:pPr>
+      <w:r>
+        <w:t xml:space="preserve">I just went through your post, and it sounds like you’re looking to build a BI system that connects CRM, invoicing, and accounting data to understand </w:t>
+      </w:r>
+      <w:r>
+        <w:rPr>
+          <w:rStyle w:val="Strong"/>
+          <w:b w:val="0"/>
+        </w:rPr>
+        <w:t>per-vehicle profitability on a daily basis</w:t>
+      </w:r>
+      <w:r>
+        <w:t>. I’d love to help.</w:t>
+      </w:r>
+    </w:p>
+    <w:p>
+      <w:pPr>
+        <w:pStyle w:val="NormalWeb"/>
+      </w:pPr>
+      <w:r>
+        <w:t>I’ve worked on BI projects where fragmented financial and operational data were unified into a single reporting layer to calculate contribution margins and track performance at a granular level. This involved integrating data from CRMs, billing systems, and accounting sources, building financial models, and designing dashboards that clearly show revenue, costs, and profitability drivers.</w:t>
+      </w:r>
+    </w:p>
+    <w:p>
+      <w:pPr>
+        <w:pStyle w:val="NormalWeb"/>
+      </w:pPr>
+      <w:r>
+        <w:t xml:space="preserve">For a project like yours, the key would be structuring the data model around the </w:t>
+      </w:r>
+      <w:r>
+        <w:rPr>
+          <w:rStyle w:val="Strong"/>
+          <w:b w:val="0"/>
+        </w:rPr>
+        <w:t>VIN level</w:t>
+      </w:r>
+      <w:r>
+        <w:t>, implementing logic for accruals like insurance, leasing, and taxes, and creating dashboards that show fleet profitability, margin breakdowns, and receivable aging in a way that leadership can quickly act on.</w:t>
+      </w:r>
+    </w:p>
+    <w:p>
+      <w:pPr>
+        <w:pStyle w:val="NormalWeb"/>
+      </w:pPr>
+      <w:r>
+        <w:lastRenderedPageBreak/>
+        <w:t>I’d love to learn more about your current data structure across Salesforce, EasyBill, and DATEV so I can suggest the most reliable approach for integration, modeling, and visualization.</w:t>
+      </w:r>
+    </w:p>
+    <w:p>
+      <w:pPr>
+        <w:pStyle w:val="NormalWeb"/>
+      </w:pPr>
+      <w:r>
+        <w:t>Would you be open to a quick call to discuss?</w:t>
+      </w:r>
+    </w:p>
+    <w:p>
+      <w:pPr>
+        <w:pStyle w:val="NormalWeb"/>
+      </w:pPr>
+      <w:r>
+        <w:rPr>
+          <w:rStyle w:val="Strong"/>
+          <w:b w:val="0"/>
+        </w:rPr>
+        <w:t>Warm regards,</w:t>
+      </w:r>
+      <w:r>
+        <w:br/>
+        <w:t>Sagar</w:t>
+      </w:r>
+    </w:p>
+    <w:p>
+      <w:pPr>
+        <w:pStyle w:val="NormalWeb"/>
+      </w:pPr>
+      <w:r>
+        <w:rPr>
+          <w:rStyle w:val="Strong"/>
+          <w:b w:val="0"/>
+        </w:rPr>
+        <w:t>Hey there,</w:t>
+      </w:r>
+    </w:p>
+    <w:p>
+      <w:pPr>
+        <w:pStyle w:val="NormalWeb"/>
+      </w:pPr>
+      <w:r>
+        <w:t>I just went through your post, and it sounds like you’re looking for someone who can build a clean, well-structured Google Spreadsheet for tracking investments with strong visualization, formulas, and usability. I’d love to help.</w:t>
+      </w:r>
+    </w:p>
+    <w:p>
+      <w:pPr>
+        <w:pStyle w:val="NormalWeb"/>
+      </w:pPr>
+      <w:r>
+        <w:t>I’ve worked on similar spreadsheet systems where I built trackers with cross-sheet logic, automated calculations, and clear dashboards so users can easily monitor performance and key metrics. I focus on creating spreadsheets that are not only technically solid but also simple, clean, and intuitive to use.</w:t>
+      </w:r>
+    </w:p>
+    <w:p>
+      <w:pPr>
+        <w:pStyle w:val="NormalWeb"/>
+      </w:pPr>
+      <w:r>
+        <w:t>I also took a look at the video you shared, and I understand the level of clarity and design you’re aiming for. I’d be happy to create something original that meets that benchmark while fitting your specific tracking needs.</w:t>
+      </w:r>
+    </w:p>
+    <w:p>
+      <w:pPr>
+        <w:pStyle w:val="NormalWeb"/>
+      </w:pPr>
+      <w:r>
+        <w:t>I’ve attached a few examples of similar work I’ve done so you can take a look.</w:t>
+      </w:r>
+    </w:p>
+    <w:p>
+      <w:pPr>
+        <w:pStyle w:val="NormalWeb"/>
+      </w:pPr>
+      <w:r>
+        <w:t>Would you be open to a quick call to discuss?</w:t>
+      </w:r>
+    </w:p>
+    <w:p>
+      <w:pPr>
+        <w:pStyle w:val="NormalWeb"/>
+      </w:pPr>
+      <w:r>
+        <w:rPr>
+          <w:rStyle w:val="Strong"/>
+          <w:b w:val="0"/>
+        </w:rPr>
+        <w:t>Warm regards,</w:t>
+      </w:r>
+      <w:r>
+        <w:br/>
+        <w:t>Sagar</w:t>
+      </w:r>
+    </w:p>
+    <w:p>
+      <w:pPr>
+        <w:pStyle w:val="NormalWeb"/>
+      </w:pPr>
+      <w:r>
+        <w:rPr>
+          <w:rStyle w:val="Strong"/>
+          <w:b w:val="0"/>
+        </w:rPr>
+        <w:t>Hey,</w:t>
+      </w:r>
+    </w:p>
+    <w:p>
+      <w:pPr>
+        <w:pStyle w:val="NormalWeb"/>
+      </w:pPr>
+      <w:r>
+        <w:t>I just went through your post, and it sounds like you’re looking for someone who can build a clean, well-structured Google Spreadsheet for tracking investments with strong visualization, formulas, and usability. I’d love to help.</w:t>
+      </w:r>
+    </w:p>
+    <w:p>
+      <w:pPr>
+        <w:pStyle w:val="NormalWeb"/>
+      </w:pPr>
+      <w:r>
+        <w:t>I’ve worked on similar spreadsheet systems where I built trackers with cross-sheet logic, automated calculations, and clear dashboards so users can easily monitor performance and key metrics. I focus on creating spreadsheets that are technically solid while keeping the design simple, clean, and intuitive.</w:t>
+      </w:r>
+    </w:p>
+    <w:p>
+      <w:pPr>
+        <w:pStyle w:val="NormalWeb"/>
+      </w:pPr>
+      <w:r>
+        <w:t>I also checked the video you shared and understand the level of clarity and design you’re aiming for. I’d be happy to create something original that meets that benchmark while fitting your specific tracking needs.</w:t>
+      </w:r>
+    </w:p>
+    <w:p>
+      <w:pPr>
+        <w:pStyle w:val="NormalWeb"/>
+      </w:pPr>
+      <w:r>
+        <w:lastRenderedPageBreak/>
+        <w:t>I’ve attached a few examples of similar work I’ve done so you can take a look.</w:t>
+      </w:r>
+    </w:p>
+    <w:p>
+      <w:pPr>
+        <w:pStyle w:val="NormalWeb"/>
+      </w:pPr>
+      <w:r>
+        <w:t>Would you be open to a quick call to discuss?</w:t>
+      </w:r>
+    </w:p>
+    <w:p>
+      <w:pPr>
+        <w:pStyle w:val="NormalWeb"/>
+      </w:pPr>
+      <w:r>
+        <w:rPr>
+          <w:rStyle w:val="Strong"/>
+          <w:b w:val="0"/>
+        </w:rPr>
+        <w:t>Warm regards,</w:t>
+      </w:r>
+      <w:r>
+        <w:br/>
+        <w:t>Sagar</w:t>
+      </w:r>
+    </w:p>
+    <w:p>
+      <w:pPr>
+        <w:pStyle w:val="NormalWeb"/>
+      </w:pPr>
+      <w:r>
+        <w:rPr>
+          <w:rStyle w:val="Strong"/>
+          <w:b w:val="0"/>
+        </w:rPr>
+        <w:t>Hey,</w:t>
+      </w:r>
+    </w:p>
+    <w:p>
+      <w:pPr>
+        <w:pStyle w:val="NormalWeb"/>
+      </w:pPr>
+      <w:r>
+        <w:t>I just went through your post, and it sounds like you’re looking for someone to build a C-level dashboard in Metabase within a short turnaround. I’d love to help.</w:t>
+      </w:r>
+    </w:p>
+    <w:p>
+      <w:pPr>
+        <w:pStyle w:val="NormalWeb"/>
+      </w:pPr>
+      <w:r>
+        <w:t>I’ve worked on similar executive dashboards where the focus was on presenting key metrics clearly for leadership while keeping the visuals clean and easy to interpret. Since you already have a designer onboard, I can focus on structuring the data queries, building the dashboard in Metabase, and ensuring the metrics are accurate and performance-optimized.</w:t>
+      </w:r>
+    </w:p>
+    <w:p>
+      <w:pPr>
+        <w:pStyle w:val="NormalWeb"/>
+      </w:pPr>
+      <w:r>
+        <w:t>Given the timeline, I’m comfortable working closely with your team to get the dashboard completed within the 2-day window.</w:t>
+      </w:r>
+    </w:p>
+    <w:p>
+      <w:pPr>
+        <w:pStyle w:val="NormalWeb"/>
+      </w:pPr>
+      <w:r>
+        <w:t>Would you be open to a quick discussion so we can review the data sources and key metrics to include?</w:t>
+      </w:r>
+    </w:p>
+    <w:p>
+      <w:pPr>
+        <w:pStyle w:val="NormalWeb"/>
+      </w:pPr>
+      <w:r>
+        <w:rPr>
+          <w:rStyle w:val="Strong"/>
+          <w:b w:val="0"/>
+        </w:rPr>
+        <w:t>Warm regards,</w:t>
+      </w:r>
+      <w:r>
+        <w:br/>
+        <w:t>Sagar</w:t>
+      </w:r>
     </w:p>
     <w:p/>
     <w:sectPr>
@@ -4389,7 +5549,7 @@
       </w:tblCellMar>
     </w:tblPr>
   </w:style>
-  <w:style w:type="table" w:styleId="LightShading">
+  <w:style w:type="table" w:customStyle="1" w:styleId="LightShading">
     <w:name w:val="Light Shading"/>
     <w:basedOn w:val="TableNormal"/>
     <w:uiPriority w:val="60"/>
@@ -4492,7 +5652,7 @@
       </w:tcPr>
     </w:tblStylePr>
   </w:style>
-  <w:style w:type="table" w:styleId="LightShading-Accent1">
+  <w:style w:type="table" w:customStyle="1" w:styleId="LightShading-Accent1">
     <w:name w:val="Light Shading Accent 1"/>
     <w:basedOn w:val="TableNormal"/>
     <w:uiPriority w:val="60"/>
@@ -5110,7 +6270,7 @@
       </w:tcPr>
     </w:tblStylePr>
   </w:style>
-  <w:style w:type="table" w:styleId="LightList">
+  <w:style w:type="table" w:customStyle="1" w:styleId="LightList">
     <w:name w:val="Light List"/>
     <w:basedOn w:val="TableNormal"/>
     <w:uiPriority w:val="61"/>
@@ -5202,7 +6362,7 @@
       </w:tcPr>
     </w:tblStylePr>
   </w:style>
-  <w:style w:type="table" w:styleId="LightList-Accent1">
+  <w:style w:type="table" w:customStyle="1" w:styleId="LightList-Accent1">
     <w:name w:val="Light List Accent 1"/>
     <w:basedOn w:val="TableNormal"/>
     <w:uiPriority w:val="61"/>
@@ -5754,7 +6914,7 @@
       </w:tcPr>
     </w:tblStylePr>
   </w:style>
-  <w:style w:type="table" w:styleId="LightGrid">
+  <w:style w:type="table" w:customStyle="1" w:styleId="LightGrid">
     <w:name w:val="Light Grid"/>
     <w:basedOn w:val="TableNormal"/>
     <w:uiPriority w:val="62"/>
@@ -5884,7 +7044,7 @@
       </w:tcPr>
     </w:tblStylePr>
   </w:style>
-  <w:style w:type="table" w:styleId="LightGrid-Accent1">
+  <w:style w:type="table" w:customStyle="1" w:styleId="LightGrid-Accent1">
     <w:name w:val="Light Grid Accent 1"/>
     <w:basedOn w:val="TableNormal"/>
     <w:uiPriority w:val="62"/>
@@ -6664,7 +7824,7 @@
       </w:tcPr>
     </w:tblStylePr>
   </w:style>
-  <w:style w:type="table" w:styleId="MediumShading1">
+  <w:style w:type="table" w:customStyle="1" w:styleId="MediumShading1">
     <w:name w:val="Medium Shading 1"/>
     <w:basedOn w:val="TableNormal"/>
     <w:uiPriority w:val="63"/>
@@ -6770,7 +7930,7 @@
       </w:tcPr>
     </w:tblStylePr>
   </w:style>
-  <w:style w:type="table" w:styleId="MediumShading1-Accent1">
+  <w:style w:type="table" w:customStyle="1" w:styleId="MediumShading1-Accent1">
     <w:name w:val="Medium Shading 1 Accent 1"/>
     <w:basedOn w:val="TableNormal"/>
     <w:uiPriority w:val="63"/>
@@ -7406,7 +8566,7 @@
       </w:tcPr>
     </w:tblStylePr>
   </w:style>
-  <w:style w:type="table" w:styleId="MediumShading2">
+  <w:style w:type="table" w:customStyle="1" w:styleId="MediumShading2">
     <w:name w:val="Medium Shading 2"/>
     <w:basedOn w:val="TableNormal"/>
     <w:uiPriority w:val="64"/>
@@ -7555,7 +8715,7 @@
       </w:tcPr>
     </w:tblStylePr>
   </w:style>
-  <w:style w:type="table" w:styleId="MediumShading2-Accent1">
+  <w:style w:type="table" w:customStyle="1" w:styleId="MediumShading2-Accent1">
     <w:name w:val="Medium Shading 2 Accent 1"/>
     <w:basedOn w:val="TableNormal"/>
     <w:uiPriority w:val="64"/>
@@ -8449,7 +9609,7 @@
       </w:tcPr>
     </w:tblStylePr>
   </w:style>
-  <w:style w:type="table" w:styleId="MediumList1">
+  <w:style w:type="table" w:customStyle="1" w:styleId="MediumList1">
     <w:name w:val="Medium List 1"/>
     <w:basedOn w:val="TableNormal"/>
     <w:uiPriority w:val="65"/>
@@ -8533,7 +9693,7 @@
       </w:tcPr>
     </w:tblStylePr>
   </w:style>
-  <w:style w:type="table" w:styleId="MediumList1-Accent1">
+  <w:style w:type="table" w:customStyle="1" w:styleId="MediumList1-Accent1">
     <w:name w:val="Medium List 1 Accent 1"/>
     <w:basedOn w:val="TableNormal"/>
     <w:uiPriority w:val="65"/>
@@ -9037,7 +10197,7 @@
       </w:tcPr>
     </w:tblStylePr>
   </w:style>
-  <w:style w:type="table" w:styleId="MediumList2">
+  <w:style w:type="table" w:customStyle="1" w:styleId="MediumList2">
     <w:name w:val="Medium List 2"/>
     <w:basedOn w:val="TableNormal"/>
     <w:uiPriority w:val="66"/>
@@ -9933,7 +11093,7 @@
       </w:tcPr>
     </w:tblStylePr>
   </w:style>
-  <w:style w:type="table" w:styleId="MediumGrid1">
+  <w:style w:type="table" w:customStyle="1" w:styleId="MediumGrid1">
     <w:name w:val="Medium Grid 1"/>
     <w:basedOn w:val="TableNormal"/>
     <w:uiPriority w:val="67"/>
@@ -10444,7 +11604,7 @@
       </w:tcPr>
     </w:tblStylePr>
   </w:style>
-  <w:style w:type="table" w:styleId="MediumGrid2">
+  <w:style w:type="table" w:customStyle="1" w:styleId="MediumGrid2">
     <w:name w:val="Medium Grid 2"/>
     <w:basedOn w:val="TableNormal"/>
     <w:uiPriority w:val="68"/>
@@ -11319,7 +12479,7 @@
       </w:tcPr>
     </w:tblStylePr>
   </w:style>
-  <w:style w:type="table" w:styleId="MediumGrid3">
+  <w:style w:type="table" w:customStyle="1" w:styleId="MediumGrid3">
     <w:name w:val="Medium Grid 3"/>
     <w:basedOn w:val="TableNormal"/>
     <w:uiPriority w:val="69"/>
@@ -12306,7 +13466,7 @@
       </w:tcPr>
     </w:tblStylePr>
   </w:style>
-  <w:style w:type="table" w:styleId="DarkList">
+  <w:style w:type="table" w:customStyle="1" w:styleId="DarkList">
     <w:name w:val="Dark List"/>
     <w:basedOn w:val="TableNormal"/>
     <w:uiPriority w:val="70"/>
@@ -13104,7 +14264,7 @@
       </w:tcPr>
     </w:tblStylePr>
   </w:style>
-  <w:style w:type="table" w:styleId="ColorfulShading">
+  <w:style w:type="table" w:customStyle="1" w:styleId="ColorfulShading">
     <w:name w:val="Colorful Shading"/>
     <w:basedOn w:val="TableNormal"/>
     <w:uiPriority w:val="71"/>
@@ -13948,7 +15108,7 @@
       </w:rPr>
     </w:tblStylePr>
   </w:style>
-  <w:style w:type="table" w:styleId="ColorfulList">
+  <w:style w:type="table" w:customStyle="1" w:styleId="ColorfulList">
     <w:name w:val="Colorful List"/>
     <w:basedOn w:val="TableNormal"/>
     <w:uiPriority w:val="72"/>
@@ -14550,7 +15710,7 @@
       </w:tcPr>
     </w:tblStylePr>
   </w:style>
-  <w:style w:type="table" w:styleId="ColorfulGrid">
+  <w:style w:type="table" w:customStyle="1" w:styleId="ColorfulGrid">
     <w:name w:val="Colorful Grid"/>
     <w:basedOn w:val="TableNormal"/>
     <w:uiPriority w:val="73"/>
@@ -15149,6 +16309,22 @@
     <w:name w:val="break"/>
     <w:basedOn w:val="Normal"/>
     <w:rsid w:val="00624609"/>
+    <w:pPr>
+      <w:spacing w:before="100" w:beforeAutospacing="1" w:after="100" w:afterAutospacing="1" w:line="240" w:lineRule="auto"/>
+    </w:pPr>
+    <w:rPr>
+      <w:rFonts w:ascii="Times New Roman" w:eastAsia="Times New Roman" w:hAnsi="Times New Roman" w:cs="Times New Roman"/>
+      <w:sz w:val="24"/>
+      <w:szCs w:val="24"/>
+    </w:rPr>
+  </w:style>
+  <w:style w:type="paragraph" w:styleId="NormalWeb">
+    <w:name w:val="Normal (Web)"/>
+    <w:basedOn w:val="Normal"/>
+    <w:uiPriority w:val="99"/>
+    <w:semiHidden/>
+    <w:unhideWhenUsed/>
+    <w:rsid w:val="001717AD"/>
     <w:pPr>
       <w:spacing w:before="100" w:beforeAutospacing="1" w:after="100" w:afterAutospacing="1" w:line="240" w:lineRule="auto"/>
     </w:pPr>

</xml_diff>